<commit_message>
feat: implementar soporte DateEntry y actualizar generador documental
</commit_message>
<xml_diff>
--- a/app/assets/templates/CARTA_MINISTERIO_DESVINCULACION.docx
+++ b/app/assets/templates/CARTA_MINISTERIO_DESVINCULACION.docx
@@ -242,26 +242,20 @@
         <w:tblLook w:val="04A0" w:firstRow="1" w:lastRow="0" w:firstColumn="1" w:lastColumn="0" w:noHBand="0" w:noVBand="1"/>
       </w:tblPr>
       <w:tblGrid>
-        <w:gridCol w:w="2133"/>
-        <w:gridCol w:w="6509"/>
+        <w:gridCol w:w="4320"/>
+        <w:gridCol w:w="4320"/>
       </w:tblGrid>
       <w:tr>
         <w:tc>
           <w:tcPr>
-            <w:tcW w:w="2133" w:type="dxa"/>
+            <w:tcW w:w="4320" w:type="dxa"/>
           </w:tcPr>
           <w:p>
             <w:pPr>
-              <w:pStyle w:val="Sinespaciado"/>
-              <w:jc w:val="both"/>
               <w:rPr>
                 <w:rFonts w:ascii="Bookman Old Style" w:hAnsi="Bookman Old Style"/>
                 <w:b/>
                 <w:bCs/>
-                <w:i/>
-                <w:sz w:val="24"/>
-                <w:szCs w:val="24"/>
-                <w:lang w:val="es-CO"/>
               </w:rPr>
             </w:pPr>
             <w:r>
@@ -269,40 +263,25 @@
                 <w:rFonts w:ascii="Bookman Old Style" w:hAnsi="Bookman Old Style"/>
                 <w:b/>
                 <w:bCs/>
-                <w:i/>
-                <w:sz w:val="24"/>
-                <w:szCs w:val="24"/>
-                <w:lang w:val="es-CO"/>
-              </w:rPr>
-              <w:t>PLACA:</w:t>
+              </w:rPr>
+              <w:t>PLACA</w:t>
             </w:r>
           </w:p>
         </w:tc>
         <w:tc>
           <w:tcPr>
-            <w:tcW w:w="6509" w:type="dxa"/>
+            <w:tcW w:w="4320" w:type="dxa"/>
           </w:tcPr>
           <w:p>
             <w:pPr>
-              <w:pStyle w:val="Sinespaciado"/>
               <w:jc w:val="right"/>
               <w:rPr>
                 <w:rFonts w:ascii="Bookman Old Style" w:hAnsi="Bookman Old Style"/>
-                <w:b/>
-                <w:bCs/>
-                <w:i/>
-                <w:sz w:val="24"/>
-                <w:szCs w:val="24"/>
-                <w:lang w:val="es-CO"/>
               </w:rPr>
             </w:pPr>
             <w:r>
               <w:rPr>
                 <w:rFonts w:ascii="Bookman Old Style" w:hAnsi="Bookman Old Style"/>
-                <w:iCs/>
-                <w:sz w:val="24"/>
-                <w:szCs w:val="24"/>
-                <w:lang w:val="es-ES"/>
               </w:rPr>
               <w:t>{{placa}}</w:t>
             </w:r>
@@ -312,18 +291,14 @@
       <w:tr>
         <w:tc>
           <w:tcPr>
-            <w:tcW w:w="2133" w:type="dxa"/>
+            <w:tcW w:w="4320" w:type="dxa"/>
           </w:tcPr>
           <w:p>
             <w:pPr>
-              <w:pStyle w:val="Sinespaciado"/>
-              <w:jc w:val="both"/>
-              <w:rPr>
-                <w:rFonts w:ascii="Bookman Old Style" w:hAnsi="Bookman Old Style"/>
-                <w:i/>
-                <w:sz w:val="24"/>
-                <w:szCs w:val="24"/>
-                <w:lang w:val="es-CO"/>
+              <w:rPr>
+                <w:rFonts w:ascii="Bookman Old Style" w:hAnsi="Bookman Old Style"/>
+                <w:b/>
+                <w:bCs/>
               </w:rPr>
             </w:pPr>
             <w:r>
@@ -331,38 +306,25 @@
                 <w:rFonts w:ascii="Bookman Old Style" w:hAnsi="Bookman Old Style"/>
                 <w:b/>
                 <w:bCs/>
-                <w:i/>
-                <w:sz w:val="24"/>
-                <w:szCs w:val="24"/>
-                <w:lang w:val="es-CO"/>
-              </w:rPr>
-              <w:t>CLASE:</w:t>
+              </w:rPr>
+              <w:t>CLASE</w:t>
             </w:r>
           </w:p>
         </w:tc>
         <w:tc>
           <w:tcPr>
-            <w:tcW w:w="6509" w:type="dxa"/>
+            <w:tcW w:w="4320" w:type="dxa"/>
           </w:tcPr>
           <w:p>
             <w:pPr>
-              <w:pStyle w:val="Sinespaciado"/>
               <w:jc w:val="right"/>
               <w:rPr>
                 <w:rFonts w:ascii="Bookman Old Style" w:hAnsi="Bookman Old Style"/>
-                <w:i/>
-                <w:sz w:val="24"/>
-                <w:szCs w:val="24"/>
-                <w:lang w:val="es-CO"/>
               </w:rPr>
             </w:pPr>
             <w:r>
               <w:rPr>
                 <w:rFonts w:ascii="Bookman Old Style" w:hAnsi="Bookman Old Style"/>
-                <w:i/>
-                <w:sz w:val="24"/>
-                <w:szCs w:val="24"/>
-                <w:lang w:val="es-ES"/>
               </w:rPr>
               <w:t>{{clase}}</w:t>
             </w:r>
@@ -372,18 +334,14 @@
       <w:tr>
         <w:tc>
           <w:tcPr>
-            <w:tcW w:w="2133" w:type="dxa"/>
+            <w:tcW w:w="4320" w:type="dxa"/>
           </w:tcPr>
           <w:p>
             <w:pPr>
-              <w:pStyle w:val="Sinespaciado"/>
-              <w:jc w:val="both"/>
-              <w:rPr>
-                <w:rFonts w:ascii="Bookman Old Style" w:hAnsi="Bookman Old Style"/>
-                <w:i/>
-                <w:sz w:val="24"/>
-                <w:szCs w:val="24"/>
-                <w:lang w:val="es-ES_tradnl"/>
+              <w:rPr>
+                <w:rFonts w:ascii="Bookman Old Style" w:hAnsi="Bookman Old Style"/>
+                <w:b/>
+                <w:bCs/>
               </w:rPr>
             </w:pPr>
             <w:r>
@@ -391,38 +349,25 @@
                 <w:rFonts w:ascii="Bookman Old Style" w:hAnsi="Bookman Old Style"/>
                 <w:b/>
                 <w:bCs/>
-                <w:i/>
-                <w:sz w:val="24"/>
-                <w:szCs w:val="24"/>
-                <w:lang w:val="es-ES_tradnl"/>
-              </w:rPr>
-              <w:t>MARCA:</w:t>
+              </w:rPr>
+              <w:t>MARCA</w:t>
             </w:r>
           </w:p>
         </w:tc>
         <w:tc>
           <w:tcPr>
-            <w:tcW w:w="6509" w:type="dxa"/>
+            <w:tcW w:w="4320" w:type="dxa"/>
           </w:tcPr>
           <w:p>
             <w:pPr>
-              <w:pStyle w:val="Sinespaciado"/>
               <w:jc w:val="right"/>
               <w:rPr>
                 <w:rFonts w:ascii="Bookman Old Style" w:hAnsi="Bookman Old Style"/>
-                <w:i/>
-                <w:sz w:val="24"/>
-                <w:szCs w:val="24"/>
-                <w:lang w:val="es-ES_tradnl"/>
               </w:rPr>
             </w:pPr>
             <w:r>
               <w:rPr>
                 <w:rFonts w:ascii="Bookman Old Style" w:hAnsi="Bookman Old Style"/>
-                <w:i/>
-                <w:sz w:val="24"/>
-                <w:szCs w:val="24"/>
-                <w:lang w:val="es-ES"/>
               </w:rPr>
               <w:t>{{marca}}</w:t>
             </w:r>
@@ -432,18 +377,14 @@
       <w:tr>
         <w:tc>
           <w:tcPr>
-            <w:tcW w:w="2133" w:type="dxa"/>
+            <w:tcW w:w="4320" w:type="dxa"/>
           </w:tcPr>
           <w:p>
             <w:pPr>
-              <w:pStyle w:val="Sinespaciado"/>
-              <w:jc w:val="both"/>
-              <w:rPr>
-                <w:rFonts w:ascii="Bookman Old Style" w:hAnsi="Bookman Old Style"/>
-                <w:i/>
-                <w:sz w:val="24"/>
-                <w:szCs w:val="24"/>
-                <w:lang w:val="es-ES_tradnl"/>
+              <w:rPr>
+                <w:rFonts w:ascii="Bookman Old Style" w:hAnsi="Bookman Old Style"/>
+                <w:b/>
+                <w:bCs/>
               </w:rPr>
             </w:pPr>
             <w:r>
@@ -451,38 +392,25 @@
                 <w:rFonts w:ascii="Bookman Old Style" w:hAnsi="Bookman Old Style"/>
                 <w:b/>
                 <w:bCs/>
-                <w:i/>
-                <w:sz w:val="24"/>
-                <w:szCs w:val="24"/>
-                <w:lang w:val="es-ES_tradnl"/>
-              </w:rPr>
-              <w:t>MODELO:</w:t>
+              </w:rPr>
+              <w:t>MODELO</w:t>
             </w:r>
           </w:p>
         </w:tc>
         <w:tc>
           <w:tcPr>
-            <w:tcW w:w="6509" w:type="dxa"/>
+            <w:tcW w:w="4320" w:type="dxa"/>
           </w:tcPr>
           <w:p>
             <w:pPr>
-              <w:pStyle w:val="Sinespaciado"/>
               <w:jc w:val="right"/>
               <w:rPr>
                 <w:rFonts w:ascii="Bookman Old Style" w:hAnsi="Bookman Old Style"/>
-                <w:i/>
-                <w:sz w:val="24"/>
-                <w:szCs w:val="24"/>
-                <w:lang w:val="es-ES_tradnl"/>
               </w:rPr>
             </w:pPr>
             <w:r>
               <w:rPr>
                 <w:rFonts w:ascii="Bookman Old Style" w:hAnsi="Bookman Old Style"/>
-                <w:i/>
-                <w:sz w:val="24"/>
-                <w:szCs w:val="24"/>
-                <w:lang w:val="es-ES"/>
               </w:rPr>
               <w:t>{{modelo}}</w:t>
             </w:r>
@@ -492,18 +420,14 @@
       <w:tr>
         <w:tc>
           <w:tcPr>
-            <w:tcW w:w="2133" w:type="dxa"/>
+            <w:tcW w:w="4320" w:type="dxa"/>
           </w:tcPr>
           <w:p>
             <w:pPr>
-              <w:pStyle w:val="Sinespaciado"/>
-              <w:jc w:val="both"/>
-              <w:rPr>
-                <w:rFonts w:ascii="Bookman Old Style" w:hAnsi="Bookman Old Style"/>
-                <w:i/>
-                <w:sz w:val="24"/>
-                <w:szCs w:val="24"/>
-                <w:lang w:val="es-ES_tradnl"/>
+              <w:rPr>
+                <w:rFonts w:ascii="Bookman Old Style" w:hAnsi="Bookman Old Style"/>
+                <w:b/>
+                <w:bCs/>
               </w:rPr>
             </w:pPr>
             <w:r>
@@ -511,38 +435,25 @@
                 <w:rFonts w:ascii="Bookman Old Style" w:hAnsi="Bookman Old Style"/>
                 <w:b/>
                 <w:bCs/>
-                <w:i/>
-                <w:sz w:val="24"/>
-                <w:szCs w:val="24"/>
-                <w:lang w:val="es-ES_tradnl"/>
-              </w:rPr>
-              <w:t>MOTOR:</w:t>
+              </w:rPr>
+              <w:t>MOTOR</w:t>
             </w:r>
           </w:p>
         </w:tc>
         <w:tc>
           <w:tcPr>
-            <w:tcW w:w="6509" w:type="dxa"/>
+            <w:tcW w:w="4320" w:type="dxa"/>
           </w:tcPr>
           <w:p>
             <w:pPr>
-              <w:pStyle w:val="Sinespaciado"/>
               <w:jc w:val="right"/>
               <w:rPr>
                 <w:rFonts w:ascii="Bookman Old Style" w:hAnsi="Bookman Old Style"/>
-                <w:i/>
-                <w:sz w:val="24"/>
-                <w:szCs w:val="24"/>
-                <w:lang w:val="es-ES_tradnl"/>
               </w:rPr>
             </w:pPr>
             <w:r>
               <w:rPr>
                 <w:rFonts w:ascii="Bookman Old Style" w:hAnsi="Bookman Old Style"/>
-                <w:i/>
-                <w:sz w:val="24"/>
-                <w:szCs w:val="24"/>
-                <w:lang w:val="es-ES"/>
               </w:rPr>
               <w:t>{{motor}}</w:t>
             </w:r>
@@ -552,18 +463,14 @@
       <w:tr>
         <w:tc>
           <w:tcPr>
-            <w:tcW w:w="2133" w:type="dxa"/>
+            <w:tcW w:w="4320" w:type="dxa"/>
           </w:tcPr>
           <w:p>
             <w:pPr>
-              <w:pStyle w:val="Sinespaciado"/>
-              <w:jc w:val="both"/>
-              <w:rPr>
-                <w:rFonts w:ascii="Bookman Old Style" w:hAnsi="Bookman Old Style"/>
-                <w:i/>
-                <w:sz w:val="24"/>
-                <w:szCs w:val="24"/>
-                <w:lang w:val="es-ES_tradnl"/>
+              <w:rPr>
+                <w:rFonts w:ascii="Bookman Old Style" w:hAnsi="Bookman Old Style"/>
+                <w:b/>
+                <w:bCs/>
               </w:rPr>
             </w:pPr>
             <w:r>
@@ -571,38 +478,25 @@
                 <w:rFonts w:ascii="Bookman Old Style" w:hAnsi="Bookman Old Style"/>
                 <w:b/>
                 <w:bCs/>
-                <w:i/>
-                <w:sz w:val="24"/>
-                <w:szCs w:val="24"/>
-                <w:lang w:val="es-ES_tradnl"/>
-              </w:rPr>
-              <w:t>CAPACIDAD:</w:t>
+              </w:rPr>
+              <w:t>CAPACIDAD</w:t>
             </w:r>
           </w:p>
         </w:tc>
         <w:tc>
           <w:tcPr>
-            <w:tcW w:w="6509" w:type="dxa"/>
+            <w:tcW w:w="4320" w:type="dxa"/>
           </w:tcPr>
           <w:p>
             <w:pPr>
-              <w:pStyle w:val="Sinespaciado"/>
               <w:jc w:val="right"/>
               <w:rPr>
                 <w:rFonts w:ascii="Bookman Old Style" w:hAnsi="Bookman Old Style"/>
-                <w:i/>
-                <w:sz w:val="24"/>
-                <w:szCs w:val="24"/>
-                <w:lang w:val="es-ES_tradnl"/>
               </w:rPr>
             </w:pPr>
             <w:r>
               <w:rPr>
                 <w:rFonts w:ascii="Bookman Old Style" w:hAnsi="Bookman Old Style"/>
-                <w:i/>
-                <w:sz w:val="24"/>
-                <w:szCs w:val="24"/>
-                <w:lang w:val="es-ES"/>
               </w:rPr>
               <w:t>{{capacidad}}</w:t>
             </w:r>
@@ -612,18 +506,14 @@
       <w:tr>
         <w:tc>
           <w:tcPr>
-            <w:tcW w:w="2133" w:type="dxa"/>
+            <w:tcW w:w="4320" w:type="dxa"/>
           </w:tcPr>
           <w:p>
             <w:pPr>
-              <w:pStyle w:val="Sinespaciado"/>
-              <w:jc w:val="both"/>
-              <w:rPr>
-                <w:rFonts w:ascii="Bookman Old Style" w:hAnsi="Bookman Old Style"/>
-                <w:i/>
-                <w:sz w:val="24"/>
-                <w:szCs w:val="24"/>
-                <w:lang w:val="es-ES_tradnl"/>
+              <w:rPr>
+                <w:rFonts w:ascii="Bookman Old Style" w:hAnsi="Bookman Old Style"/>
+                <w:b/>
+                <w:bCs/>
               </w:rPr>
             </w:pPr>
             <w:r>
@@ -631,40 +521,27 @@
                 <w:rFonts w:ascii="Bookman Old Style" w:hAnsi="Bookman Old Style"/>
                 <w:b/>
                 <w:bCs/>
-                <w:i/>
-                <w:sz w:val="24"/>
-                <w:szCs w:val="24"/>
-                <w:lang w:val="es-ES_tradnl"/>
-              </w:rPr>
-              <w:t>MODALIDAD:</w:t>
+              </w:rPr>
+              <w:t>MODALIDAD</w:t>
             </w:r>
           </w:p>
         </w:tc>
         <w:tc>
           <w:tcPr>
-            <w:tcW w:w="6509" w:type="dxa"/>
+            <w:tcW w:w="4320" w:type="dxa"/>
           </w:tcPr>
           <w:p>
             <w:pPr>
-              <w:pStyle w:val="Sinespaciado"/>
               <w:jc w:val="right"/>
               <w:rPr>
                 <w:rFonts w:ascii="Bookman Old Style" w:hAnsi="Bookman Old Style"/>
-                <w:i/>
-                <w:sz w:val="24"/>
-                <w:szCs w:val="24"/>
-                <w:lang w:val="es-ES_tradnl"/>
               </w:rPr>
             </w:pPr>
             <w:r>
               <w:rPr>
                 <w:rFonts w:ascii="Bookman Old Style" w:hAnsi="Bookman Old Style"/>
-                <w:i/>
-                <w:sz w:val="24"/>
-                <w:szCs w:val="24"/>
-                <w:lang w:val="es-ES_tradnl"/>
-              </w:rPr>
-              <w:t>BASICO</w:t>
+              </w:rPr>
+              <w:t>{{modalidad}}</w:t>
             </w:r>
           </w:p>
         </w:tc>
@@ -672,18 +549,14 @@
       <w:tr>
         <w:tc>
           <w:tcPr>
-            <w:tcW w:w="2133" w:type="dxa"/>
+            <w:tcW w:w="4320" w:type="dxa"/>
           </w:tcPr>
           <w:p>
             <w:pPr>
-              <w:pStyle w:val="Sinespaciado"/>
-              <w:jc w:val="both"/>
-              <w:rPr>
-                <w:rFonts w:ascii="Bookman Old Style" w:hAnsi="Bookman Old Style"/>
-                <w:i/>
-                <w:sz w:val="24"/>
-                <w:szCs w:val="24"/>
-                <w:lang w:val="es-CO"/>
+              <w:rPr>
+                <w:rFonts w:ascii="Bookman Old Style" w:hAnsi="Bookman Old Style"/>
+                <w:b/>
+                <w:bCs/>
               </w:rPr>
             </w:pPr>
             <w:r>
@@ -691,40 +564,27 @@
                 <w:rFonts w:ascii="Bookman Old Style" w:hAnsi="Bookman Old Style"/>
                 <w:b/>
                 <w:bCs/>
-                <w:i/>
-                <w:sz w:val="24"/>
-                <w:szCs w:val="24"/>
-                <w:lang w:val="es-CO"/>
-              </w:rPr>
-              <w:t>COMBUSTIBLE:</w:t>
+              </w:rPr>
+              <w:t>COMBUSTIBLE</w:t>
             </w:r>
           </w:p>
         </w:tc>
         <w:tc>
           <w:tcPr>
-            <w:tcW w:w="6509" w:type="dxa"/>
+            <w:tcW w:w="4320" w:type="dxa"/>
           </w:tcPr>
           <w:p>
             <w:pPr>
-              <w:pStyle w:val="Sinespaciado"/>
               <w:jc w:val="right"/>
               <w:rPr>
                 <w:rFonts w:ascii="Bookman Old Style" w:hAnsi="Bookman Old Style"/>
-                <w:i/>
-                <w:sz w:val="24"/>
-                <w:szCs w:val="24"/>
-                <w:lang w:val="es-CO"/>
               </w:rPr>
             </w:pPr>
             <w:r>
               <w:rPr>
                 <w:rFonts w:ascii="Bookman Old Style" w:hAnsi="Bookman Old Style"/>
-                <w:i/>
-                <w:sz w:val="24"/>
-                <w:szCs w:val="24"/>
-                <w:lang w:val="es-CO"/>
-              </w:rPr>
-              <w:t>DIESEL</w:t>
+              </w:rPr>
+              <w:t>{{combustible}}</w:t>
             </w:r>
           </w:p>
         </w:tc>
@@ -732,17 +592,14 @@
       <w:tr>
         <w:tc>
           <w:tcPr>
-            <w:tcW w:w="2133" w:type="dxa"/>
+            <w:tcW w:w="4320" w:type="dxa"/>
           </w:tcPr>
           <w:p>
             <w:pPr>
-              <w:jc w:val="both"/>
               <w:rPr>
                 <w:rFonts w:ascii="Bookman Old Style" w:hAnsi="Bookman Old Style"/>
                 <w:b/>
                 <w:bCs/>
-                <w:i/>
-                <w:lang w:val="es-CO"/>
               </w:rPr>
             </w:pPr>
             <w:r>
@@ -750,35 +607,27 @@
                 <w:rFonts w:ascii="Bookman Old Style" w:hAnsi="Bookman Old Style"/>
                 <w:b/>
                 <w:bCs/>
-                <w:i/>
-                <w:lang w:val="es-CO"/>
-              </w:rPr>
-              <w:t xml:space="preserve">TIPO:                  </w:t>
+              </w:rPr>
+              <w:t>TIPO</w:t>
             </w:r>
           </w:p>
         </w:tc>
         <w:tc>
           <w:tcPr>
-            <w:tcW w:w="6509" w:type="dxa"/>
+            <w:tcW w:w="4320" w:type="dxa"/>
           </w:tcPr>
           <w:p>
             <w:pPr>
               <w:jc w:val="right"/>
               <w:rPr>
                 <w:rFonts w:ascii="Bookman Old Style" w:hAnsi="Bookman Old Style"/>
-                <w:b/>
-                <w:bCs/>
-                <w:i/>
-                <w:lang w:val="es-CO"/>
               </w:rPr>
             </w:pPr>
             <w:r>
               <w:rPr>
                 <w:rFonts w:ascii="Bookman Old Style" w:hAnsi="Bookman Old Style"/>
-                <w:i/>
-                <w:lang w:val="es-CO"/>
-              </w:rPr>
-              <w:t>CERRADA</w:t>
+              </w:rPr>
+              <w:t>{{tipo}}</w:t>
             </w:r>
           </w:p>
         </w:tc>
@@ -809,7 +658,21 @@
         <w:rPr>
           <w:rFonts w:ascii="Bookman Old Style" w:hAnsi="Bookman Old Style"/>
         </w:rPr>
-        <w:t>{{fecha_larga}}</w:t>
+        <w:t>{{</w:t>
+      </w:r>
+      <w:proofErr w:type="spellStart"/>
+      <w:r>
+        <w:rPr>
+          <w:rFonts w:ascii="Bookman Old Style" w:hAnsi="Bookman Old Style"/>
+        </w:rPr>
+        <w:t>fecha_larga</w:t>
+      </w:r>
+      <w:proofErr w:type="spellEnd"/>
+      <w:r>
+        <w:rPr>
+          <w:rFonts w:ascii="Bookman Old Style" w:hAnsi="Bookman Old Style"/>
+        </w:rPr>
+        <w:t>}}</w:t>
       </w:r>
     </w:p>
     <w:p>
@@ -1139,7 +1002,7 @@
     <w:lsdException w:name="Table Web 2" w:semiHidden="1" w:unhideWhenUsed="1"/>
     <w:lsdException w:name="Table Web 3" w:semiHidden="1" w:unhideWhenUsed="1"/>
     <w:lsdException w:name="Balloon Text" w:semiHidden="1" w:unhideWhenUsed="1"/>
-    <w:lsdException w:name="Table Grid" w:uiPriority="39"/>
+    <w:lsdException w:name="Table Grid" w:uiPriority="59"/>
     <w:lsdException w:name="Table Theme" w:semiHidden="1" w:unhideWhenUsed="1"/>
     <w:lsdException w:name="Placeholder Text" w:semiHidden="1"/>
     <w:lsdException w:name="No Spacing" w:uiPriority="1" w:qFormat="1"/>
@@ -1956,7 +1819,7 @@
   <w:style w:type="table" w:styleId="Tablaconcuadrcula">
     <w:name w:val="Table Grid"/>
     <w:basedOn w:val="Tablanormal"/>
-    <w:uiPriority w:val="39"/>
+    <w:uiPriority w:val="59"/>
     <w:rsid w:val="00B13740"/>
     <w:pPr>
       <w:spacing w:after="0" w:line="240" w:lineRule="auto"/>

</xml_diff>